<commit_message>
Update INETUM address to 5-7 rue Touzet Gaillard, Saint-Ouen
Co-authored-by: walid-hassayouneinetum <walid-hassayouneinetum@users.noreply.github.com>
</commit_message>
<xml_diff>
--- a/Demission_Walid_HASSAYOUNE_INETUM.docx
+++ b/Demission_Walid_HASSAYOUNE_INETUM.docx
@@ -36,11 +36,11 @@
         <w:br/>
       </w:r>
       <w:r>
-        <w:t>1 Place Charles de Gaulle</w:t>
+        <w:t>5-7 rue Touzet Gaillard</w:t>
         <w:br/>
       </w:r>
       <w:r>
-        <w:t>78180 Montigny-le-Bretonneux</w:t>
+        <w:t>93400 Saint-Ouen</w:t>
       </w:r>
     </w:p>
     <w:p/>
@@ -54,7 +54,7 @@
     </w:p>
     <w:p>
       <w:r>
-        <w:t>Montigny-le-Bretonneux, le 20/07/2026</w:t>
+        <w:t>Saint-Ouen, le 20/07/2026</w:t>
       </w:r>
     </w:p>
     <w:p/>

</xml_diff>

<commit_message>
Update sender address to 9 impasse Morel, Vénissieux
Co-authored-by: walid-hassayouneinetum <walid-hassayouneinetum@users.noreply.github.com>
</commit_message>
<xml_diff>
--- a/Demission_Walid_HASSAYOUNE_INETUM.docx
+++ b/Demission_Walid_HASSAYOUNE_INETUM.docx
@@ -14,11 +14,11 @@
         <w:br/>
       </w:r>
       <w:r>
-        <w:t>[Votre adresse postale actuelle]</w:t>
+        <w:t>9 impasse Morel</w:t>
         <w:br/>
       </w:r>
       <w:r>
-        <w:t>[Code postal] [Ville]</w:t>
+        <w:t>69200 Vénissieux</w:t>
       </w:r>
     </w:p>
     <w:p/>
@@ -54,7 +54,7 @@
     </w:p>
     <w:p>
       <w:r>
-        <w:t>Saint-Ouen, le 20/07/2026</w:t>
+        <w:t>Vénissieux, le 20/07/2026</w:t>
       </w:r>
     </w:p>
     <w:p/>

</xml_diff>

<commit_message>
Update notice to 1 month from 22/07/2026, end date subject to review
Co-authored-by: walid-hassayouneinetum <walid-hassayouneinetum@users.noreply.github.com>
</commit_message>
<xml_diff>
--- a/Demission_Walid_HASSAYOUNE_INETUM.docx
+++ b/Demission_Walid_HASSAYOUNE_INETUM.docx
@@ -54,7 +54,7 @@
     </w:p>
     <w:p>
       <w:r>
-        <w:t>Vénissieux, le 20/07/2026</w:t>
+        <w:t>Vénissieux, le 22/07/2026</w:t>
       </w:r>
     </w:p>
     <w:p/>
@@ -71,12 +71,12 @@
     </w:p>
     <w:p>
       <w:r>
-        <w:t>Conformément aux conditions applicables à mon contrat de travail, mon préavis est d'une durée de trois mois (90 jours), ce qui porterait la date de fin de mon contrat au 18/10/2026.</w:t>
+        <w:t>Conformément à l'article 6 de mon contrat de travail, mon préavis est d'une durée d'un mois. À compter de ce jour (22/07/2026), la date de fin de mon contrat serait fixée au 22/08/2026.</w:t>
       </w:r>
     </w:p>
     <w:p>
       <w:r>
-        <w:t>Toutefois, je souhaiterais pouvoir quitter l'entreprise avant cette échéance et reste à votre disposition afin d'échanger sur les modalités d'une réduction ou d'une dispense partielle de mon préavis, dans les meilleures conditions pour toutes les parties.</w:t>
+        <w:t>Cette date pourra être revue d'un commun accord, notamment dans le cadre d'une réduction ou d'une dispense partielle de mon préavis. Je reste à votre disposition pour en échanger dans les meilleures conditions pour toutes les parties.</w:t>
       </w:r>
     </w:p>
     <w:p>

</xml_diff>

<commit_message>
Update resignation: SYNTEC 3-month notice, request departure 15/09/2026
Co-authored-by: walid-hassayouneinetum <walid-hassayouneinetum@users.noreply.github.com>
</commit_message>
<xml_diff>
--- a/Demission_Walid_HASSAYOUNE_INETUM.docx
+++ b/Demission_Walid_HASSAYOUNE_INETUM.docx
@@ -49,7 +49,7 @@
         <w:rPr>
           <w:b/>
         </w:rPr>
-        <w:t>Objet : Démission</w:t>
+        <w:t>Objet : Démission – Demande de réduction de préavis</w:t>
       </w:r>
     </w:p>
     <w:p>
@@ -71,12 +71,12 @@
     </w:p>
     <w:p>
       <w:r>
-        <w:t>Conformément à l'article 6 de mon contrat de travail, mon préavis est d'une durée d'un mois. À compter de ce jour (22/07/2026), la date de fin de mon contrat serait fixée au 22/08/2026.</w:t>
+        <w:t>En qualité de cadre relevant de la convention collective SYNTEC, mon préavis est normalement d'une durée de trois mois. À compter du 22/07/2026, la date de fin de mon contrat serait donc fixée au 22/10/2026.</w:t>
       </w:r>
     </w:p>
     <w:p>
       <w:r>
-        <w:t>Cette date pourra être revue d'un commun accord, notamment dans le cadre d'une réduction ou d'une dispense partielle de mon préavis. Je reste à votre disposition pour en échanger dans les meilleures conditions pour toutes les parties.</w:t>
+        <w:t>Toutefois, je sollicite une réduction de mon préavis afin de quitter l'entreprise au 15/09/2026. Je reste à votre disposition pour échanger sur les modalités de cette réduction, dans les meilleures conditions pour toutes les parties.</w:t>
       </w:r>
     </w:p>
     <w:p>

</xml_diff>